<commit_message>
Docs: Dokumentation auf HTTPS aus dem Installer nachziehen
Claude-Session: https://claude.ai/code/session_01WWQRZFtc9VQL44uFzKGvUY
</commit_message>
<xml_diff>
--- a/docs/systemdoku/copilot/Notenportal-Kontext.docx
+++ b/docs/systemdoku/copilot/Notenportal-Kontext.docx
@@ -2014,7 +2014,7 @@
         <w:t xml:space="preserve">Voraussetzungen:</w:t>
       </w:r>
       <w:r>
-        <w:t xml:space="preserve"> Ubuntu 24.04 LTS (frisch genügt), ein Benutzer mit </w:t>
+        <w:t xml:space="preserve"> Ubuntu 24.04 LTS oder neuer, erprobt bis 26.04 (frisch genügt), ein Benutzer mit </w:t>
       </w:r>
       <w:r>
         <w:rPr>
@@ -2025,7 +2025,7 @@
         <w:t xml:space="preserve">sudo</w:t>
       </w:r>
       <w:r>
-        <w:t xml:space="preserve">, rund 2 GB Arbeitsspeicher, Port 80 frei (sonst </w:t>
+        <w:t xml:space="preserve">, rund 2 GB Arbeitsspeicher, Ports 80 und 443 frei (sonst </w:t>
       </w:r>
       <w:r>
         <w:rPr>
@@ -2034,6 +2034,17 @@
           <w:color w:val="1F3864"/>
         </w:rPr>
         <w:t xml:space="preserve">--port</w:t>
+      </w:r>
+      <w:r>
+        <w:t xml:space="preserve"> bzw. </w:t>
+      </w:r>
+      <w:r>
+        <w:rPr>
+          <w:rFonts w:ascii="Consolas" w:hAnsi="Consolas"/>
+          <w:sz w:val="19"/>
+          <w:color w:val="1F3864"/>
+        </w:rPr>
+        <w:t xml:space="preserve">--https-port</w:t>
       </w:r>
       <w:r>
         <w:t xml:space="preserve">), Internetzugang während der Installation. Apache, MariaDB, PHP, Node und Composer installiert das Skript selbst.</w:t>
@@ -2527,6 +2538,61 @@
               <w:rPr>
                 <w:sz w:val="19"/>
               </w:rPr>
+              <w:t xml:space="preserve">HTTPS</w:t>
+            </w:r>
+          </w:p>
+        </w:tc>
+        <w:tc>
+          <w:tcPr>
+            <w:tcW w:w="4680" w:type="dxa"/>
+          </w:tcPr>
+          <w:p>
+            <w:pPr>
+              <w:spacing w:before="40" w:after="40"/>
+              <w:rPr>
+                <w:sz w:val="19"/>
+              </w:rPr>
+            </w:pPr>
+            <w:r>
+              <w:rPr>
+                <w:sz w:val="19"/>
+              </w:rPr>
+              <w:t xml:space="preserve">Eigene Zertifizierungsstelle, Serverzertifikat für alle Namen und Adressen der Maschine, </w:t>
+            </w:r>
+            <w:r>
+              <w:rPr>
+                <w:sz w:val="19"/>
+                <w:rFonts w:ascii="Consolas" w:hAnsi="Consolas"/>
+                <w:sz w:val="19"/>
+                <w:color w:val="1F3864"/>
+              </w:rPr>
+              <w:t xml:space="preserve">APP_URL</w:t>
+            </w:r>
+            <w:r>
+              <w:rPr>
+                <w:sz w:val="19"/>
+              </w:rPr>
+              <w:t xml:space="preserve"> und Secure-Cookie</w:t>
+            </w:r>
+          </w:p>
+        </w:tc>
+      </w:tr>
+      <w:tr>
+        <w:tc>
+          <w:tcPr>
+            <w:tcW w:w="4680" w:type="dxa"/>
+          </w:tcPr>
+          <w:p>
+            <w:pPr>
+              <w:spacing w:before="40" w:after="40"/>
+              <w:rPr>
+                <w:sz w:val="19"/>
+              </w:rPr>
+            </w:pPr>
+            <w:r>
+              <w:rPr>
+                <w:sz w:val="19"/>
+              </w:rPr>
               <w:t xml:space="preserve">Webserver</w:t>
             </w:r>
           </w:p>
@@ -2546,7 +2612,7 @@
               <w:rPr>
                 <w:sz w:val="19"/>
               </w:rPr>
-              <w:t xml:space="preserve">VirtualHost, Port, ufw-Freigabe falls ufw läuft</w:t>
+              <w:t xml:space="preserve">VirtualHosts für HTTP und HTTPS, Umleitung von HTTP, ufw-Freigabe falls ufw läuft</w:t>
             </w:r>
           </w:p>
         </w:tc>
@@ -2616,6 +2682,46 @@
               <w:rPr>
                 <w:sz w:val="19"/>
               </w:rPr>
+              <w:t xml:space="preserve">Sicherung</w:t>
+            </w:r>
+          </w:p>
+        </w:tc>
+        <w:tc>
+          <w:tcPr>
+            <w:tcW w:w="4680" w:type="dxa"/>
+          </w:tcPr>
+          <w:p>
+            <w:pPr>
+              <w:spacing w:before="40" w:after="40"/>
+              <w:rPr>
+                <w:sz w:val="19"/>
+              </w:rPr>
+            </w:pPr>
+            <w:r>
+              <w:rPr>
+                <w:sz w:val="19"/>
+              </w:rPr>
+              <w:t xml:space="preserve">Bei einer Neuinstallation gleich die erste Sicherung</w:t>
+            </w:r>
+          </w:p>
+        </w:tc>
+      </w:tr>
+      <w:tr>
+        <w:tc>
+          <w:tcPr>
+            <w:tcW w:w="4680" w:type="dxa"/>
+          </w:tcPr>
+          <w:p>
+            <w:pPr>
+              <w:spacing w:before="40" w:after="40"/>
+              <w:rPr>
+                <w:sz w:val="19"/>
+              </w:rPr>
+            </w:pPr>
+            <w:r>
+              <w:rPr>
+                <w:sz w:val="19"/>
+              </w:rPr>
               <w:t xml:space="preserve">Abschluss</w:t>
             </w:r>
           </w:p>
@@ -2645,6 +2751,12 @@
                 <w:color w:val="1F3864"/>
               </w:rPr>
               <w:t xml:space="preserve">/login</w:t>
+            </w:r>
+            <w:r>
+              <w:rPr>
+                <w:sz w:val="19"/>
+              </w:rPr>
+              <w:t xml:space="preserve"> über HTTPS samt Prüfung der Zertifikatskette</w:t>
             </w:r>
           </w:p>
         </w:tc>
@@ -2702,7 +2814,43 @@
           <w:rFonts w:ascii="Consolas" w:hAnsi="Consolas"/>
           <w:sz w:val="18"/>
         </w:rPr>
-        <w:t xml:space="preserve">sudo ./install.sh --host notenportal.example.ch # Servername statt erkannter IP</w:t>
+        <w:t xml:space="preserve">sudo ./install.sh --host notenportal.example.ch # Servername im vhost und im Zertifikat</w:t>
+      </w:r>
+    </w:p>
+    <w:p>
+      <w:pPr>
+        <w:spacing w:before="0" w:after="0"/>
+        <w:shd w:val="clear" w:fill="F2F4F8"/>
+        <w:spacing w:before="0" w:after="0" w:line="240" w:lineRule="auto"/>
+        <w:rPr>
+          <w:rFonts w:ascii="Consolas" w:hAnsi="Consolas"/>
+          <w:sz w:val="18"/>
+        </w:rPr>
+      </w:pPr>
+      <w:r>
+        <w:rPr>
+          <w:rFonts w:ascii="Consolas" w:hAnsi="Consolas"/>
+          <w:sz w:val="18"/>
+        </w:rPr>
+        <w:t xml:space="preserve">sudo ./install.sh --ohne-https                  # nur HTTP, ohne Zertifikat</w:t>
+      </w:r>
+    </w:p>
+    <w:p>
+      <w:pPr>
+        <w:spacing w:before="0" w:after="0"/>
+        <w:shd w:val="clear" w:fill="F2F4F8"/>
+        <w:spacing w:before="0" w:after="0" w:line="240" w:lineRule="auto"/>
+        <w:rPr>
+          <w:rFonts w:ascii="Consolas" w:hAnsi="Consolas"/>
+          <w:sz w:val="18"/>
+        </w:rPr>
+      </w:pPr>
+      <w:r>
+        <w:rPr>
+          <w:rFonts w:ascii="Consolas" w:hAnsi="Consolas"/>
+          <w:sz w:val="18"/>
+        </w:rPr>
+        <w:t xml:space="preserve">sudo ./install.sh --https-port 8443             # HTTPS auf einem anderen Port</w:t>
       </w:r>
     </w:p>
     <w:p>
@@ -3387,7 +3535,18 @@
         <w:t xml:space="preserve">Was von Hand bleibt:</w:t>
       </w:r>
       <w:r>
-        <w:t xml:space="preserve"> HTTPS-Zertifikat (richtet das Skript nicht ein), SMTP unter Admin → Betrieb → E-Mail eintragen (Erstinstallation schreibt Mails nur ins Log), Ziel für die Kopie ausser Haus, Zeitzonen der Datenbank (</w:t>
+        <w:t xml:space="preserve"> DNS-Eintrag für den Namen auf dem zuständigen DNS-Server (das Skript nennt am Schluss den nötigen A-Record), Import der Zertifizierungsstelle auf den Clients (</w:t>
+      </w:r>
+      <w:r>
+        <w:rPr>
+          <w:rFonts w:ascii="Consolas" w:hAnsi="Consolas"/>
+          <w:sz w:val="19"/>
+          <w:color w:val="1F3864"/>
+        </w:rPr>
+        <w:t xml:space="preserve">http://&lt;name&gt;/lab-ca.crt</w:t>
+      </w:r>
+      <w:r>
+        <w:t xml:space="preserve">), SMTP unter Admin → Betrieb → E-Mail eintragen (Erstinstallation schreibt Mails nur ins Log), Ziel für die Kopie ausser Haus, Zeitzonen der Datenbank (</w:t>
       </w:r>
       <w:r>
         <w:rPr>
@@ -3724,7 +3883,7 @@
               <w:rPr>
                 <w:sz w:val="19"/>
               </w:rPr>
-              <w:t xml:space="preserve">Zugang zum Lab-Netz, Adresse </w:t>
+              <w:t xml:space="preserve">Zugang zum Lab-Netz über VPN, Adresse </w:t>
             </w:r>
             <w:r>
               <w:rPr>
@@ -3733,22 +3892,13 @@
                 <w:sz w:val="19"/>
                 <w:color w:val="1F3864"/>
               </w:rPr>
-              <w:t xml:space="preserve">http://172.26.14.101</w:t>
-            </w:r>
-            <w:r>
-              <w:rPr>
-                <w:sz w:val="19"/>
-              </w:rPr>
-              <w:t xml:space="preserve"> bzw. </w:t>
-            </w:r>
-            <w:r>
-              <w:rPr>
-                <w:sz w:val="19"/>
-                <w:rFonts w:ascii="Consolas" w:hAnsi="Consolas"/>
-                <w:sz w:val="19"/>
-                <w:color w:val="1F3864"/>
-              </w:rPr>
-              <w:t xml:space="preserve">https://</w:t>
+              <w:t xml:space="preserve">https://notenportal</w:t>
+            </w:r>
+            <w:r>
+              <w:rPr>
+                <w:sz w:val="19"/>
+              </w:rPr>
+              <w:t xml:space="preserve">; HTTP leitet um</w:t>
             </w:r>
           </w:p>
         </w:tc>
@@ -3830,7 +3980,7 @@
         <w:t xml:space="preserve">Lab-CA importieren:</w:t>
       </w:r>
       <w:r>
-        <w:t xml:space="preserve"> Windows </w:t>
+        <w:t xml:space="preserve"> Herunterladen unter </w:t>
       </w:r>
       <w:r>
         <w:rPr>
@@ -3838,10 +3988,10 @@
           <w:sz w:val="19"/>
           <w:color w:val="1F3864"/>
         </w:rPr>
-        <w:t xml:space="preserve">certmgr.msc</w:t>
-      </w:r>
-      <w:r>
-        <w:t xml:space="preserve"> → «Vertrauenswürdige Stammzertifizierungsstellen» → Importieren. macOS Schlüsselbundverwaltung → System → hineinziehen → «Immer vertrauen». Firefox Einstellungen → Zertifikate → Zertifizierungsstellen → Importieren.</w:t>
+        <w:t xml:space="preserve">http://&lt;name&gt;/lab-ca.crt</w:t>
+      </w:r>
+      <w:r>
+        <w:t xml:space="preserve"> – bewusst über HTTP, weil der Abruf über HTTPS vor dem Import genau die Warnung auslösen würde, die er behebt. Windows Doppelklick → «Lokaler Computer» → «Vertrauenswürdige Stammzertifizierungsstellen». macOS Schlüsselbundverwaltung → System → «Immer vertrauen». Firefox hat einen eigenen Speicher: Einstellungen → Zertifikate → Zertifizierungsstellen → Importieren. Ohne Import ist die Verbindung verschlüsselt, aber ungeprüft – der Browser warnt bei jedem Besuch.</w:t>
       </w:r>
     </w:p>
     <w:p>
@@ -11116,7 +11266,25 @@
         <w:t xml:space="preserve">Ctrl + K</w:t>
       </w:r>
       <w:r>
+        <w:t xml:space="preserve"> oder </w:t>
+      </w:r>
+      <w:r>
+        <w:rPr>
+          <w:b/>
+        </w:rPr>
+        <w:t xml:space="preserve">/</w:t>
+      </w:r>
+      <w:r>
         <w:t xml:space="preserve"> Befehlspalette, </w:t>
+      </w:r>
+      <w:r>
+        <w:rPr>
+          <w:b/>
+        </w:rPr>
+        <w:t xml:space="preserve">n</w:t>
+      </w:r>
+      <w:r>
+        <w:t xml:space="preserve"> neue Note, </w:t>
       </w:r>
       <w:r>
         <w:rPr>

</xml_diff>